<commit_message>
feat: refine Perfect Shade proposal generator
</commit_message>
<xml_diff>
--- a/templates/perfect_shade_bid_template.docx
+++ b/templates/perfect_shade_bid_template.docx
@@ -27,7 +27,7 @@
           <w:color w:val="505050"/>
           <w:sz w:val="23"/>
         </w:rPr>
-        <w:t>BID PROPOSAL</w:t>
+        <w:t>{{ bid.document_type_display }}</w:t>
       </w:r>
     </w:p>
     <w:tbl>
@@ -123,7 +123,7 @@
     </w:tbl>
     <w:p>
       <w:pPr>
-        <w:spacing w:before="120" w:after="20"/>
+        <w:spacing w:before="100" w:after="20"/>
       </w:pPr>
       <w:r>
         <w:rPr>
@@ -395,7 +395,7 @@
                 <w:color w:val="1F4E79"/>
                 <w:sz w:val="21"/>
               </w:rPr>
-              <w:t>Contact Information</w:t>
+              <w:t>Owner</w:t>
             </w:r>
           </w:p>
         </w:tc>
@@ -429,7 +429,7 @@
     </w:tbl>
     <w:p>
       <w:pPr>
-        <w:spacing w:before="120" w:after="20"/>
+        <w:spacing w:before="100" w:after="20"/>
       </w:pPr>
       <w:r>
         <w:rPr>
@@ -444,7 +444,7 @@
     </w:p>
     <w:p>
       <w:pPr>
-        <w:spacing w:before="0" w:after="40" w:line="240" w:lineRule="auto"/>
+        <w:spacing w:before="0" w:after="20" w:line="240" w:lineRule="auto"/>
       </w:pPr>
       <w:r>
         <w:rPr>
@@ -467,7 +467,7 @@
           <w:i w:val="0"/>
           <w:sz w:val="2"/>
         </w:rPr>
-        <w:t>{% for item in scope_items %}</w:t>
+        <w:t>{%p for item in scope_items %}</w:t>
       </w:r>
     </w:p>
     <w:p>
@@ -497,7 +497,7 @@
           <w:i w:val="0"/>
           <w:sz w:val="2"/>
         </w:rPr>
-        <w:t>{% endfor %}</w:t>
+        <w:t>{%p endfor %}</w:t>
       </w:r>
     </w:p>
     <w:p>
@@ -511,12 +511,12 @@
           <w:i w:val="0"/>
           <w:sz w:val="2"/>
         </w:rPr>
-        <w:t>{% if addenda_acknowledgements %}</w:t>
+        <w:t>{%p if addenda_acknowledgements %}</w:t>
       </w:r>
     </w:p>
     <w:p>
       <w:pPr>
-        <w:spacing w:before="120" w:after="20"/>
+        <w:spacing w:before="100" w:after="20"/>
       </w:pPr>
       <w:r>
         <w:rPr>
@@ -531,7 +531,7 @@
     </w:p>
     <w:p>
       <w:pPr>
-        <w:spacing w:before="0" w:after="40" w:line="240" w:lineRule="auto"/>
+        <w:spacing w:before="0" w:after="20" w:line="240" w:lineRule="auto"/>
       </w:pPr>
       <w:r>
         <w:rPr>
@@ -554,7 +554,7 @@
           <w:i w:val="0"/>
           <w:sz w:val="2"/>
         </w:rPr>
-        <w:t>{% for addendum in addenda_acknowledgements %}</w:t>
+        <w:t>{%p for addendum in addenda_acknowledgements %}</w:t>
       </w:r>
     </w:p>
     <w:p>
@@ -584,7 +584,7 @@
           <w:i w:val="0"/>
           <w:sz w:val="2"/>
         </w:rPr>
-        <w:t>{% endfor %}</w:t>
+        <w:t>{%p endfor %}</w:t>
       </w:r>
     </w:p>
     <w:p>
@@ -598,12 +598,12 @@
           <w:i w:val="0"/>
           <w:sz w:val="2"/>
         </w:rPr>
-        <w:t>{% endif %}</w:t>
+        <w:t>{%p endif %}</w:t>
       </w:r>
     </w:p>
     <w:p>
       <w:pPr>
-        <w:spacing w:before="120" w:after="20"/>
+        <w:spacing w:before="100" w:after="20"/>
       </w:pPr>
       <w:r>
         <w:rPr>
@@ -781,7 +781,7 @@
         <w:tc>
           <w:tcPr>
             <w:tcW w:type="dxa" w:w="5112"/>
-            <w:shd w:fill="DDEBF7"/>
+            <w:shd w:fill="BDD7EE"/>
             <w:tcBorders>
               <w:top w:val="single" w:sz="6" w:space="0" w:color="9FBAD0"/>
               <w:left w:val="single" w:sz="6" w:space="0" w:color="9FBAD0"/>
@@ -797,7 +797,7 @@
             <w:r>
               <w:rPr>
                 <w:rFonts w:ascii="Aptos" w:hAnsi="Aptos"/>
-                <w:b w:val="0"/>
+                <w:b/>
                 <w:i w:val="0"/>
                 <w:color w:val="1F4E79"/>
                 <w:sz w:val="21"/>
@@ -809,7 +809,7 @@
         <w:tc>
           <w:tcPr>
             <w:tcW w:type="dxa" w:w="5112"/>
-            <w:shd w:fill="DDEBF7"/>
+            <w:shd w:fill="BDD7EE"/>
             <w:tcBorders>
               <w:top w:val="single" w:sz="6" w:space="0" w:color="9FBAD0"/>
               <w:left w:val="single" w:sz="6" w:space="0" w:color="9FBAD0"/>
@@ -825,68 +825,11 @@
             <w:r>
               <w:rPr>
                 <w:rFonts w:ascii="Aptos" w:hAnsi="Aptos"/>
-                <w:b w:val="0"/>
+                <w:b/>
                 <w:i w:val="0"/>
                 <w:sz w:val="21"/>
               </w:rPr>
               <w:t>{{ bid.subtotal_display }}</w:t>
-            </w:r>
-          </w:p>
-        </w:tc>
-      </w:tr>
-      <w:tr>
-        <w:tc>
-          <w:tcPr>
-            <w:tcW w:type="dxa" w:w="5112"/>
-            <w:shd w:fill="DDEBF7"/>
-            <w:tcBorders>
-              <w:top w:val="single" w:sz="6" w:space="0" w:color="9FBAD0"/>
-              <w:left w:val="single" w:sz="6" w:space="0" w:color="9FBAD0"/>
-              <w:bottom w:val="single" w:sz="6" w:space="0" w:color="9FBAD0"/>
-              <w:right w:val="single" w:sz="6" w:space="0" w:color="9FBAD0"/>
-            </w:tcBorders>
-          </w:tcPr>
-          <w:p>
-            <w:pPr>
-              <w:spacing w:before="0" w:after="0" w:line="240" w:lineRule="auto"/>
-              <w:jc w:val="right"/>
-            </w:pPr>
-            <w:r>
-              <w:rPr>
-                <w:rFonts w:ascii="Aptos" w:hAnsi="Aptos"/>
-                <w:b w:val="0"/>
-                <w:i w:val="0"/>
-                <w:color w:val="1F4E79"/>
-                <w:sz w:val="21"/>
-              </w:rPr>
-              <w:t>Sales Tax</w:t>
-            </w:r>
-          </w:p>
-        </w:tc>
-        <w:tc>
-          <w:tcPr>
-            <w:tcW w:type="dxa" w:w="5112"/>
-            <w:shd w:fill="DDEBF7"/>
-            <w:tcBorders>
-              <w:top w:val="single" w:sz="6" w:space="0" w:color="9FBAD0"/>
-              <w:left w:val="single" w:sz="6" w:space="0" w:color="9FBAD0"/>
-              <w:bottom w:val="single" w:sz="6" w:space="0" w:color="9FBAD0"/>
-              <w:right w:val="single" w:sz="6" w:space="0" w:color="9FBAD0"/>
-            </w:tcBorders>
-          </w:tcPr>
-          <w:p>
-            <w:pPr>
-              <w:spacing w:before="0" w:after="0" w:line="240" w:lineRule="auto"/>
-              <w:jc w:val="right"/>
-            </w:pPr>
-            <w:r>
-              <w:rPr>
-                <w:rFonts w:ascii="Aptos" w:hAnsi="Aptos"/>
-                <w:b w:val="0"/>
-                <w:i w:val="0"/>
-                <w:sz w:val="21"/>
-              </w:rPr>
-              <w:t>{{ bid.sales_tax_amount_display }}</w:t>
             </w:r>
           </w:p>
         </w:tc>
@@ -1065,7 +1008,283 @@
     </w:tbl>
     <w:p>
       <w:pPr>
-        <w:spacing w:before="120" w:after="20"/>
+        <w:spacing w:before="0" w:after="0" w:line="240" w:lineRule="auto"/>
+      </w:pPr>
+      <w:r>
+        <w:rPr>
+          <w:rFonts w:ascii="Aptos" w:hAnsi="Aptos"/>
+          <w:b w:val="0"/>
+          <w:i w:val="0"/>
+          <w:sz w:val="2"/>
+        </w:rPr>
+        <w:t>{%p if bid.include_alternate_pricing and alternate_pricing_lines %}</w:t>
+      </w:r>
+    </w:p>
+    <w:p>
+      <w:pPr>
+        <w:spacing w:before="100" w:after="20"/>
+      </w:pPr>
+      <w:r>
+        <w:rPr>
+          <w:rFonts w:ascii="Aptos" w:hAnsi="Aptos"/>
+          <w:b/>
+          <w:i/>
+          <w:color w:val="1F4E79"/>
+          <w:sz w:val="27"/>
+        </w:rPr>
+        <w:t>Alternate Pricing</w:t>
+      </w:r>
+    </w:p>
+    <w:tbl>
+      <w:tblPr>
+        <w:tblStyle w:val="TableGrid"/>
+        <w:tblW w:type="auto" w:w="0"/>
+        <w:jc w:val="center"/>
+        <w:tblLook w:firstColumn="1" w:firstRow="1" w:lastColumn="0" w:lastRow="0" w:noHBand="0" w:noVBand="1" w:val="04A0"/>
+      </w:tblPr>
+      <w:tblGrid>
+        <w:gridCol w:w="5112"/>
+        <w:gridCol w:w="5112"/>
+      </w:tblGrid>
+      <w:tr>
+        <w:tc>
+          <w:tcPr>
+            <w:tcW w:type="dxa" w:w="5112"/>
+            <w:shd w:fill="1F4E79"/>
+            <w:tcBorders>
+              <w:top w:val="single" w:sz="6" w:space="0" w:color="9FBAD0"/>
+              <w:left w:val="single" w:sz="6" w:space="0" w:color="9FBAD0"/>
+              <w:bottom w:val="single" w:sz="6" w:space="0" w:color="9FBAD0"/>
+              <w:right w:val="single" w:sz="6" w:space="0" w:color="9FBAD0"/>
+            </w:tcBorders>
+          </w:tcPr>
+          <w:p>
+            <w:pPr>
+              <w:spacing w:before="0" w:after="0" w:line="240" w:lineRule="auto"/>
+            </w:pPr>
+            <w:r>
+              <w:rPr>
+                <w:rFonts w:ascii="Aptos" w:hAnsi="Aptos"/>
+                <w:b/>
+                <w:i w:val="0"/>
+                <w:color w:val="FFFFFF"/>
+                <w:sz w:val="21"/>
+              </w:rPr>
+              <w:t>Description</w:t>
+            </w:r>
+          </w:p>
+        </w:tc>
+        <w:tc>
+          <w:tcPr>
+            <w:tcW w:type="dxa" w:w="5112"/>
+            <w:shd w:fill="1F4E79"/>
+            <w:tcBorders>
+              <w:top w:val="single" w:sz="6" w:space="0" w:color="9FBAD0"/>
+              <w:left w:val="single" w:sz="6" w:space="0" w:color="9FBAD0"/>
+              <w:bottom w:val="single" w:sz="6" w:space="0" w:color="9FBAD0"/>
+              <w:right w:val="single" w:sz="6" w:space="0" w:color="9FBAD0"/>
+            </w:tcBorders>
+          </w:tcPr>
+          <w:p>
+            <w:pPr>
+              <w:spacing w:before="0" w:after="0" w:line="240" w:lineRule="auto"/>
+              <w:jc w:val="right"/>
+            </w:pPr>
+            <w:r>
+              <w:rPr>
+                <w:rFonts w:ascii="Aptos" w:hAnsi="Aptos"/>
+                <w:b/>
+                <w:i w:val="0"/>
+                <w:color w:val="FFFFFF"/>
+                <w:sz w:val="21"/>
+              </w:rPr>
+              <w:t>Amount</w:t>
+            </w:r>
+          </w:p>
+        </w:tc>
+      </w:tr>
+      <w:tr>
+        <w:tc>
+          <w:tcPr>
+            <w:tcW w:type="dxa" w:w="5112"/>
+          </w:tcPr>
+          <w:p>
+            <w:r>
+              <w:t>{%tr for line in alternate_pricing_lines %}</w:t>
+            </w:r>
+          </w:p>
+        </w:tc>
+        <w:tc>
+          <w:tcPr>
+            <w:tcW w:type="dxa" w:w="5112"/>
+          </w:tcPr>
+          <w:p>
+            <w:r/>
+          </w:p>
+        </w:tc>
+      </w:tr>
+      <w:tr>
+        <w:tc>
+          <w:tcPr>
+            <w:tcW w:type="dxa" w:w="5112"/>
+            <w:tcBorders>
+              <w:top w:val="single" w:sz="6" w:space="0" w:color="9FBAD0"/>
+              <w:left w:val="single" w:sz="6" w:space="0" w:color="9FBAD0"/>
+              <w:bottom w:val="single" w:sz="6" w:space="0" w:color="9FBAD0"/>
+              <w:right w:val="single" w:sz="6" w:space="0" w:color="9FBAD0"/>
+            </w:tcBorders>
+          </w:tcPr>
+          <w:p>
+            <w:pPr>
+              <w:spacing w:before="0" w:after="0" w:line="240" w:lineRule="auto"/>
+            </w:pPr>
+            <w:r>
+              <w:rPr>
+                <w:rFonts w:ascii="Aptos" w:hAnsi="Aptos"/>
+                <w:b w:val="0"/>
+                <w:i w:val="0"/>
+                <w:sz w:val="21"/>
+              </w:rPr>
+              <w:t>{{ line.description }}</w:t>
+            </w:r>
+          </w:p>
+        </w:tc>
+        <w:tc>
+          <w:tcPr>
+            <w:tcW w:type="dxa" w:w="5112"/>
+            <w:tcBorders>
+              <w:top w:val="single" w:sz="6" w:space="0" w:color="9FBAD0"/>
+              <w:left w:val="single" w:sz="6" w:space="0" w:color="9FBAD0"/>
+              <w:bottom w:val="single" w:sz="6" w:space="0" w:color="9FBAD0"/>
+              <w:right w:val="single" w:sz="6" w:space="0" w:color="9FBAD0"/>
+            </w:tcBorders>
+          </w:tcPr>
+          <w:p>
+            <w:pPr>
+              <w:spacing w:before="0" w:after="0" w:line="240" w:lineRule="auto"/>
+              <w:jc w:val="right"/>
+            </w:pPr>
+            <w:r>
+              <w:rPr>
+                <w:rFonts w:ascii="Aptos" w:hAnsi="Aptos"/>
+                <w:b w:val="0"/>
+                <w:i w:val="0"/>
+                <w:sz w:val="21"/>
+              </w:rPr>
+              <w:t>{{ line.amount_display }}</w:t>
+            </w:r>
+          </w:p>
+        </w:tc>
+      </w:tr>
+      <w:tr>
+        <w:tc>
+          <w:tcPr>
+            <w:tcW w:type="dxa" w:w="5112"/>
+          </w:tcPr>
+          <w:p>
+            <w:r>
+              <w:t>{%tr endfor %}</w:t>
+            </w:r>
+          </w:p>
+        </w:tc>
+        <w:tc>
+          <w:tcPr>
+            <w:tcW w:type="dxa" w:w="5112"/>
+          </w:tcPr>
+          <w:p>
+            <w:r/>
+          </w:p>
+        </w:tc>
+      </w:tr>
+      <w:tr>
+        <w:tc>
+          <w:tcPr>
+            <w:tcW w:type="dxa" w:w="5112"/>
+            <w:shd w:fill="BDD7EE"/>
+            <w:tcBorders>
+              <w:top w:val="single" w:sz="6" w:space="0" w:color="9FBAD0"/>
+              <w:left w:val="single" w:sz="6" w:space="0" w:color="9FBAD0"/>
+              <w:bottom w:val="single" w:sz="6" w:space="0" w:color="9FBAD0"/>
+              <w:right w:val="single" w:sz="6" w:space="0" w:color="9FBAD0"/>
+            </w:tcBorders>
+          </w:tcPr>
+          <w:p>
+            <w:pPr>
+              <w:spacing w:before="0" w:after="0" w:line="240" w:lineRule="auto"/>
+              <w:jc w:val="right"/>
+            </w:pPr>
+            <w:r>
+              <w:rPr>
+                <w:rFonts w:ascii="Aptos" w:hAnsi="Aptos"/>
+                <w:b/>
+                <w:i w:val="0"/>
+                <w:color w:val="1F4E79"/>
+                <w:sz w:val="21"/>
+              </w:rPr>
+              <w:t>Alternate Total</w:t>
+            </w:r>
+          </w:p>
+        </w:tc>
+        <w:tc>
+          <w:tcPr>
+            <w:tcW w:type="dxa" w:w="5112"/>
+            <w:shd w:fill="BDD7EE"/>
+            <w:tcBorders>
+              <w:top w:val="single" w:sz="6" w:space="0" w:color="9FBAD0"/>
+              <w:left w:val="single" w:sz="6" w:space="0" w:color="9FBAD0"/>
+              <w:bottom w:val="single" w:sz="6" w:space="0" w:color="9FBAD0"/>
+              <w:right w:val="single" w:sz="6" w:space="0" w:color="9FBAD0"/>
+            </w:tcBorders>
+          </w:tcPr>
+          <w:p>
+            <w:pPr>
+              <w:spacing w:before="0" w:after="0" w:line="240" w:lineRule="auto"/>
+              <w:jc w:val="right"/>
+            </w:pPr>
+            <w:r>
+              <w:rPr>
+                <w:rFonts w:ascii="Aptos" w:hAnsi="Aptos"/>
+                <w:b/>
+                <w:i w:val="0"/>
+                <w:sz w:val="21"/>
+              </w:rPr>
+              <w:t>{{ bid.alternate_pricing_total_display }}</w:t>
+            </w:r>
+          </w:p>
+        </w:tc>
+      </w:tr>
+    </w:tbl>
+    <w:p>
+      <w:pPr>
+        <w:spacing w:before="0" w:after="20" w:line="240" w:lineRule="auto"/>
+      </w:pPr>
+      <w:r>
+        <w:rPr>
+          <w:rFonts w:ascii="Aptos" w:hAnsi="Aptos"/>
+          <w:b w:val="0"/>
+          <w:i w:val="0"/>
+          <w:sz w:val="21"/>
+        </w:rPr>
+        <w:t>Alternate pricing is provided for consideration only and is not included in the base bid total unless accepted in writing.</w:t>
+      </w:r>
+    </w:p>
+    <w:p>
+      <w:pPr>
+        <w:spacing w:before="0" w:after="0" w:line="240" w:lineRule="auto"/>
+      </w:pPr>
+      <w:r>
+        <w:rPr>
+          <w:rFonts w:ascii="Aptos" w:hAnsi="Aptos"/>
+          <w:b w:val="0"/>
+          <w:i w:val="0"/>
+          <w:sz w:val="2"/>
+        </w:rPr>
+        <w:t>{%p endif %}</w:t>
+      </w:r>
+    </w:p>
+    <w:p>
+      <w:pPr>
+        <w:spacing w:before="100" w:after="20"/>
       </w:pPr>
       <w:r>
         <w:rPr>
@@ -1160,6 +1379,38 @@
     </w:p>
     <w:p>
       <w:pPr>
+        <w:pStyle w:val="ListBullet"/>
+        <w:spacing w:before="0" w:after="0" w:line="240" w:lineRule="auto"/>
+        <w:ind w:left="317"/>
+      </w:pPr>
+      <w:r>
+        <w:rPr>
+          <w:rFonts w:ascii="Aptos" w:hAnsi="Aptos"/>
+          <w:b w:val="0"/>
+          <w:i w:val="0"/>
+          <w:sz w:val="21"/>
+        </w:rPr>
+        <w:t>Maximum retainage shall be limited to 5% of the contract amount unless otherwise agreed in writing.</w:t>
+      </w:r>
+    </w:p>
+    <w:p>
+      <w:pPr>
+        <w:pStyle w:val="ListBullet"/>
+        <w:spacing w:before="0" w:after="0" w:line="240" w:lineRule="auto"/>
+        <w:ind w:left="317"/>
+      </w:pPr>
+      <w:r>
+        <w:rPr>
+          <w:rFonts w:ascii="Aptos" w:hAnsi="Aptos"/>
+          <w:b w:val="0"/>
+          <w:i w:val="0"/>
+          <w:sz w:val="21"/>
+        </w:rPr>
+        <w:t>Applicable sales tax will be added unless a valid tax exemption certificate is provided.</w:t>
+      </w:r>
+    </w:p>
+    <w:p>
+      <w:pPr>
         <w:spacing w:before="0" w:after="0" w:line="240" w:lineRule="auto"/>
       </w:pPr>
       <w:r>
@@ -1169,12 +1420,69 @@
           <w:i w:val="0"/>
           <w:sz w:val="2"/>
         </w:rPr>
-        <w:t>{% if additional_terms_items %}</w:t>
+        <w:t>{%p if bid.include_prevailing_wage_statement and bid.prevailing_wage_statement %}</w:t>
       </w:r>
     </w:p>
     <w:p>
       <w:pPr>
-        <w:spacing w:before="0" w:after="40" w:line="240" w:lineRule="auto"/>
+        <w:spacing w:before="100" w:after="20"/>
+      </w:pPr>
+      <w:r>
+        <w:rPr>
+          <w:rFonts w:ascii="Aptos" w:hAnsi="Aptos"/>
+          <w:b/>
+          <w:i/>
+          <w:color w:val="1F4E79"/>
+          <w:sz w:val="27"/>
+        </w:rPr>
+        <w:t>Prevailing Wage</w:t>
+      </w:r>
+    </w:p>
+    <w:p>
+      <w:pPr>
+        <w:spacing w:before="0" w:after="20" w:line="240" w:lineRule="auto"/>
+      </w:pPr>
+      <w:r>
+        <w:rPr>
+          <w:rFonts w:ascii="Aptos" w:hAnsi="Aptos"/>
+          <w:b w:val="0"/>
+          <w:i w:val="0"/>
+          <w:sz w:val="21"/>
+        </w:rPr>
+        <w:t>{{ bid.prevailing_wage_statement }}</w:t>
+      </w:r>
+    </w:p>
+    <w:p>
+      <w:pPr>
+        <w:spacing w:before="0" w:after="0" w:line="240" w:lineRule="auto"/>
+      </w:pPr>
+      <w:r>
+        <w:rPr>
+          <w:rFonts w:ascii="Aptos" w:hAnsi="Aptos"/>
+          <w:b w:val="0"/>
+          <w:i w:val="0"/>
+          <w:sz w:val="2"/>
+        </w:rPr>
+        <w:t>{%p endif %}</w:t>
+      </w:r>
+    </w:p>
+    <w:p>
+      <w:pPr>
+        <w:spacing w:before="0" w:after="0" w:line="240" w:lineRule="auto"/>
+      </w:pPr>
+      <w:r>
+        <w:rPr>
+          <w:rFonts w:ascii="Aptos" w:hAnsi="Aptos"/>
+          <w:b w:val="0"/>
+          <w:i w:val="0"/>
+          <w:sz w:val="2"/>
+        </w:rPr>
+        <w:t>{%p if additional_terms_items %}</w:t>
+      </w:r>
+    </w:p>
+    <w:p>
+      <w:pPr>
+        <w:spacing w:before="0" w:after="20" w:line="240" w:lineRule="auto"/>
       </w:pPr>
       <w:r>
         <w:rPr>
@@ -1197,7 +1505,7 @@
           <w:i w:val="0"/>
           <w:sz w:val="2"/>
         </w:rPr>
-        <w:t>{% for term in additional_terms_items %}</w:t>
+        <w:t>{%p for term in additional_terms_items %}</w:t>
       </w:r>
     </w:p>
     <w:p>
@@ -1227,7 +1535,7 @@
           <w:i w:val="0"/>
           <w:sz w:val="2"/>
         </w:rPr>
-        <w:t>{% endfor %}</w:t>
+        <w:t>{%p endfor %}</w:t>
       </w:r>
     </w:p>
     <w:p>
@@ -1241,12 +1549,12 @@
           <w:i w:val="0"/>
           <w:sz w:val="2"/>
         </w:rPr>
-        <w:t>{% endif %}</w:t>
+        <w:t>{%p endif %}</w:t>
       </w:r>
     </w:p>
     <w:p>
       <w:pPr>
-        <w:spacing w:before="120" w:after="20"/>
+        <w:spacing w:before="100" w:after="20"/>
       </w:pPr>
       <w:r>
         <w:rPr>
@@ -1261,7 +1569,7 @@
     </w:p>
     <w:p>
       <w:pPr>
-        <w:spacing w:before="0" w:after="40" w:line="240" w:lineRule="auto"/>
+        <w:spacing w:before="0" w:after="20" w:line="240" w:lineRule="auto"/>
       </w:pPr>
       <w:r>
         <w:rPr>
@@ -1270,12 +1578,12 @@
           <w:i w:val="0"/>
           <w:sz w:val="21"/>
         </w:rPr>
-        <w:t>This proposal includes one final field measurement visit per phase. Areas to be measured must be complete and ready for accurate measurement before final field verification is scheduled. Scheduling a measurement visit confirms that the site is ready. Additional visits required due to incomplete conditions, design changes, revised dimensions, or remeasurement requests may be billed as additional work, including labor and travel expenses.</w:t>
+        <w:t>Measurement Readiness: Final measurements should not be requested or scheduled until the project area is ready, accessible, and reasonably prepared for accurate measuring. If there are questions about site readiness, mounting conditions, product requirements, or any other measurement-related requirements, Customer/Contractor should contact Perfect Shade LLC before requesting or scheduling final measurements. Additional trips, re-measures, or delays caused by incomplete site conditions, inaccessible areas, unclear requirements, construction changes, or other conditions outside Perfect Shade LLC's control may result in additional charges.</w:t>
       </w:r>
     </w:p>
     <w:p>
       <w:pPr>
-        <w:spacing w:before="120" w:after="20"/>
+        <w:spacing w:before="100" w:after="20"/>
       </w:pPr>
       <w:r>
         <w:rPr>
@@ -1290,7 +1598,7 @@
     </w:p>
     <w:p>
       <w:pPr>
-        <w:spacing w:before="0" w:after="40" w:line="240" w:lineRule="auto"/>
+        <w:spacing w:before="0" w:after="20" w:line="240" w:lineRule="auto"/>
       </w:pPr>
       <w:r>
         <w:rPr>
@@ -1299,12 +1607,12 @@
           <w:i w:val="0"/>
           <w:sz w:val="21"/>
         </w:rPr>
-        <w:t>Perfect Shade provides a one-year craftsmanship warranty on installation labor. This warranty covers defects in workmanship under normal use and does not cover product defects, misuse, damage by others, changes to surrounding construction, or conditions outside Perfect Shade’s control.</w:t>
+        <w:t>Perfect Shade provides a one-year craftsmanship warranty on installation labor. This warranty covers defects in workmanship under normal use and does not cover product defects, misuse, damage by others, changes to surrounding construction, or conditions outside Perfect Shade's control.</w:t>
       </w:r>
     </w:p>
     <w:p>
       <w:pPr>
-        <w:spacing w:before="120" w:after="20"/>
+        <w:spacing w:before="100" w:after="20"/>
       </w:pPr>
       <w:r>
         <w:rPr>
@@ -1314,12 +1622,12 @@
           <w:color w:val="1F4E79"/>
           <w:sz w:val="27"/>
         </w:rPr>
-        <w:t>About Perfect Shade</w:t>
+        <w:t>Company Qualifications</w:t>
       </w:r>
     </w:p>
     <w:p>
       <w:pPr>
-        <w:spacing w:before="0" w:after="40" w:line="240" w:lineRule="auto"/>
+        <w:spacing w:before="0" w:after="20" w:line="240" w:lineRule="auto"/>
       </w:pPr>
       <w:r>
         <w:rPr>
@@ -1328,7 +1636,7 @@
           <w:i w:val="0"/>
           <w:sz w:val="21"/>
         </w:rPr>
-        <w:t>Perfect Shade is a locally owned and operated window covering company known for consistent delivery, attention to detail, and dependable project execution. We work closely with general contractors and project managers to provide practical solutions that meet both budget and performance expectations. Our approach includes thoughtful value engineering when appropriate, helping streamline product selection without sacrificing quality or durability. With a strong reputation for reliability and clean professional installations, Perfect Shade takes pride in completing each project on time and with high standards of workmanship.</w:t>
+        <w:t>Perfect Shade LLC is a locally owned and operated window covering company serving commercial, healthcare, municipal, educational, multifamily, and professional facilities throughout Eastern Oregon and Eastern Washington. We routinely assist with value engineering, product coordination, dependable project execution, and clean professional installation. Our lead installer has more than 15 years of experience installing window coverings throughout the Tri-Cities and surrounding region. References are available upon request.</w:t>
       </w:r>
     </w:p>
     <w:p>
@@ -1342,12 +1650,12 @@
           <w:i w:val="0"/>
           <w:sz w:val="2"/>
         </w:rPr>
-        <w:t>{% if bid.project_notes %}</w:t>
+        <w:t>{%p if bid.project_notes %}</w:t>
       </w:r>
     </w:p>
     <w:p>
       <w:pPr>
-        <w:spacing w:before="120" w:after="20"/>
+        <w:spacing w:before="100" w:after="20"/>
       </w:pPr>
       <w:r>
         <w:rPr>
@@ -1362,7 +1670,7 @@
     </w:p>
     <w:p>
       <w:pPr>
-        <w:spacing w:before="0" w:after="40" w:line="240" w:lineRule="auto"/>
+        <w:spacing w:before="0" w:after="20" w:line="240" w:lineRule="auto"/>
       </w:pPr>
       <w:r>
         <w:rPr>
@@ -1385,12 +1693,12 @@
           <w:i w:val="0"/>
           <w:sz w:val="2"/>
         </w:rPr>
-        <w:t>{% endif %}</w:t>
+        <w:t>{%p endif %}</w:t>
       </w:r>
     </w:p>
     <w:p>
       <w:pPr>
-        <w:spacing w:before="120" w:after="20"/>
+        <w:spacing w:before="100" w:after="20"/>
       </w:pPr>
       <w:r>
         <w:rPr>
@@ -1405,7 +1713,7 @@
     </w:p>
     <w:p>
       <w:pPr>
-        <w:spacing w:before="0" w:after="40" w:line="240" w:lineRule="auto"/>
+        <w:spacing w:before="0" w:after="20" w:line="240" w:lineRule="auto"/>
       </w:pPr>
       <w:r>
         <w:rPr>
@@ -1482,7 +1790,7 @@
                 <w:color w:val="1F4E79"/>
                 <w:sz w:val="21"/>
               </w:rPr>
-              <w:t>Client Authorized Signature</w:t>
+              <w:t>Authorized Signature</w:t>
               <w:br/>
               <w:br/>
               <w:br/>

</xml_diff>